<commit_message>
docs: update Scrum artifacts through HU-029
</commit_message>
<xml_diff>
--- a/Fase 2/Evidencias Proyecto/Evidencias de documentación/Scrum/05_Revision_Daily_Meeting_CitaJusta.docx
+++ b/Fase 2/Evidencias Proyecto/Evidencias de documentación/Scrum/05_Revision_Daily_Meeting_CitaJusta.docx
@@ -194,6 +194,7 @@
       </w:tblGrid>
       <w:tr>
         <w:trPr>
+          <w:cantSplit/>
           <w:jc w:val="center"/>
         </w:trPr>
         <w:tc>
@@ -273,6 +274,7 @@
       </w:tr>
       <w:tr>
         <w:trPr>
+          <w:cantSplit/>
           <w:jc w:val="center"/>
         </w:trPr>
         <w:tc>
@@ -313,6 +315,7 @@
       </w:tr>
       <w:tr>
         <w:trPr>
+          <w:cantSplit/>
           <w:jc w:val="center"/>
         </w:trPr>
         <w:tc>
@@ -342,13 +345,14 @@
           </w:tcPr>
           <w:p>
             <w:r>
-              <w:t>1.7</w:t>
+              <w:t>1.8</w:t>
             </w:r>
           </w:p>
         </w:tc>
       </w:tr>
       <w:tr>
         <w:trPr>
+          <w:cantSplit/>
           <w:jc w:val="center"/>
         </w:trPr>
         <w:tc>
@@ -381,7 +385,7 @@
             </w:r>
             <w:proofErr w:type="spellEnd"/>
             <w:r>
-              <w:t xml:space="preserve"> con HU-025 y HU-026 </w:t>
+              <w:t xml:space="preserve"> con HU-027, HU-028 y HU-029 </w:t>
             </w:r>
             <w:proofErr w:type="spellStart"/>
             <w:r>
@@ -389,45 +393,27 @@
             </w:r>
             <w:proofErr w:type="spellEnd"/>
             <w:r>
-              <w:t xml:space="preserve">; MVP Web </w:t>
+              <w:t xml:space="preserve">; Sprint 7 Desktop/Tauri </w:t>
             </w:r>
             <w:proofErr w:type="spellStart"/>
             <w:r>
-              <w:t>cerrado</w:t>
+              <w:t>en</w:t>
             </w:r>
             <w:proofErr w:type="spellEnd"/>
             <w:r>
-              <w:t xml:space="preserve"> y </w:t>
+              <w:t xml:space="preserve"> </w:t>
             </w:r>
             <w:proofErr w:type="spellStart"/>
             <w:r>
-              <w:t>transición</w:t>
+              <w:t>progreso</w:t>
             </w:r>
             <w:proofErr w:type="spellEnd"/>
-            <w:r>
-              <w:t xml:space="preserve"> </w:t>
-            </w:r>
-            <w:proofErr w:type="spellStart"/>
-            <w:r>
-              <w:t>preparada</w:t>
-            </w:r>
-            <w:proofErr w:type="spellEnd"/>
-            <w:r>
-              <w:t xml:space="preserve"> </w:t>
-            </w:r>
-            <w:proofErr w:type="spellStart"/>
-            <w:r>
-              <w:t>hacia</w:t>
-            </w:r>
-            <w:proofErr w:type="spellEnd"/>
-            <w:r>
-              <w:t xml:space="preserve"> Desktop/Tauri</w:t>
-            </w:r>
           </w:p>
         </w:tc>
       </w:tr>
       <w:tr>
         <w:trPr>
+          <w:cantSplit/>
           <w:jc w:val="center"/>
         </w:trPr>
         <w:tc>
@@ -457,7 +443,7 @@
           </w:tcPr>
           <w:p>
             <w:r>
-              <w:t xml:space="preserve">22 de </w:t>
+              <w:t xml:space="preserve">23 de </w:t>
             </w:r>
             <w:proofErr w:type="spellStart"/>
             <w:r>
@@ -472,6 +458,7 @@
       </w:tr>
       <w:tr>
         <w:trPr>
+          <w:cantSplit/>
           <w:jc w:val="center"/>
         </w:trPr>
         <w:tc>
@@ -1687,6 +1674,7 @@
       </w:tblGrid>
       <w:tr>
         <w:trPr>
+          <w:cantSplit/>
           <w:jc w:val="center"/>
         </w:trPr>
         <w:tc>
@@ -1774,6 +1762,7 @@
       </w:tr>
       <w:tr>
         <w:trPr>
+          <w:cantSplit/>
           <w:jc w:val="center"/>
         </w:trPr>
         <w:tc>
@@ -1849,6 +1838,7 @@
       </w:tr>
       <w:tr>
         <w:trPr>
+          <w:cantSplit/>
           <w:jc w:val="center"/>
         </w:trPr>
         <w:tc>
@@ -1961,6 +1951,7 @@
       </w:tr>
       <w:tr>
         <w:trPr>
+          <w:cantSplit/>
           <w:jc w:val="center"/>
         </w:trPr>
         <w:tc>
@@ -2036,6 +2027,7 @@
       </w:tr>
       <w:tr>
         <w:trPr>
+          <w:cantSplit/>
           <w:jc w:val="center"/>
         </w:trPr>
         <w:tc>
@@ -2108,6 +2100,7 @@
       </w:tr>
       <w:tr>
         <w:trPr>
+          <w:cantSplit/>
           <w:jc w:val="center"/>
         </w:trPr>
         <w:tc>
@@ -2172,6 +2165,7 @@
       </w:tr>
       <w:tr>
         <w:trPr>
+          <w:cantSplit/>
           <w:jc w:val="center"/>
         </w:trPr>
         <w:tc>
@@ -2239,6 +2233,7 @@
       </w:tr>
       <w:tr>
         <w:trPr>
+          <w:cantSplit/>
           <w:jc w:val="center"/>
         </w:trPr>
         <w:tc>
@@ -2317,6 +2312,7 @@
       </w:tr>
       <w:tr>
         <w:trPr>
+          <w:cantSplit/>
           <w:jc w:val="center"/>
         </w:trPr>
         <w:tc>
@@ -2422,6 +2418,7 @@
       </w:tr>
       <w:tr>
         <w:trPr>
+          <w:cantSplit/>
           <w:jc w:val="center"/>
         </w:trPr>
         <w:tc>
@@ -2493,6 +2490,106 @@
           <w:p>
             <w:r>
               <w:t>Alta</w:t>
+            </w:r>
+          </w:p>
+        </w:tc>
+        <w:tc>
+          <w:tcPr>
+            <w:tcW w:w="2556" w:type="dxa"/>
+          </w:tcPr>
+          <w:p>
+            <w:r>
+              <w:t>Done</w:t>
+            </w:r>
+          </w:p>
+        </w:tc>
+      </w:tr>
+      <w:tr>
+        <w:trPr>
+          <w:cantSplit/>
+          <w:jc w:val="center"/>
+        </w:trPr>
+        <w:tc>
+          <w:tcPr>
+            <w:tcW w:w="2556" w:type="dxa"/>
+          </w:tcPr>
+          <w:p>
+            <w:r>
+              <w:lastRenderedPageBreak/>
+              <w:t>HU-027/028/029</w:t>
+            </w:r>
+          </w:p>
+        </w:tc>
+        <w:tc>
+          <w:tcPr>
+            <w:tcW w:w="2556" w:type="dxa"/>
+          </w:tcPr>
+          <w:p>
+            <w:r>
+              <w:t xml:space="preserve">Desktop/Tauri: </w:t>
+            </w:r>
+            <w:proofErr w:type="spellStart"/>
+            <w:r>
+              <w:t>fundación</w:t>
+            </w:r>
+            <w:proofErr w:type="spellEnd"/>
+            <w:r>
+              <w:t xml:space="preserve">, </w:t>
+            </w:r>
+            <w:proofErr w:type="spellStart"/>
+            <w:r>
+              <w:t>autenticación</w:t>
+            </w:r>
+            <w:proofErr w:type="spellEnd"/>
+            <w:r>
+              <w:t xml:space="preserve"> </w:t>
+            </w:r>
+            <w:proofErr w:type="spellStart"/>
+            <w:r>
+              <w:t>compartida</w:t>
+            </w:r>
+            <w:proofErr w:type="spellEnd"/>
+            <w:r>
+              <w:t xml:space="preserve"> y </w:t>
+            </w:r>
+            <w:proofErr w:type="spellStart"/>
+            <w:r>
+              <w:t>gestión</w:t>
+            </w:r>
+            <w:proofErr w:type="spellEnd"/>
+            <w:r>
+              <w:t xml:space="preserve"> </w:t>
+            </w:r>
+            <w:proofErr w:type="spellStart"/>
+            <w:r>
+              <w:t>institucional</w:t>
+            </w:r>
+            <w:proofErr w:type="spellEnd"/>
+            <w:r>
+              <w:t xml:space="preserve"> de </w:t>
+            </w:r>
+            <w:proofErr w:type="spellStart"/>
+            <w:r>
+              <w:t>sedes</w:t>
+            </w:r>
+            <w:proofErr w:type="spellEnd"/>
+            <w:r>
+              <w:t>/</w:t>
+            </w:r>
+            <w:proofErr w:type="spellStart"/>
+            <w:r>
+              <w:t>servicios</w:t>
+            </w:r>
+            <w:proofErr w:type="spellEnd"/>
+          </w:p>
+        </w:tc>
+        <w:tc>
+          <w:tcPr>
+            <w:tcW w:w="2556" w:type="dxa"/>
+          </w:tcPr>
+          <w:p>
+            <w:r>
+              <w:t>Alta/Crítica</w:t>
             </w:r>
           </w:p>
         </w:tc>
@@ -2515,7 +2612,6 @@
       <w:bookmarkStart w:id="1" w:name="_heading=h.79f6f8u0s4wx" w:colFirst="0" w:colLast="0"/>
       <w:bookmarkEnd w:id="1"/>
       <w:r>
-        <w:lastRenderedPageBreak/>
         <w:t xml:space="preserve">3. Sprint / </w:t>
       </w:r>
       <w:proofErr w:type="spellStart"/>
@@ -2535,11 +2631,11 @@
     <w:p/>
     <w:p>
       <w:r>
-        <w:t xml:space="preserve">Sprint 4: Agenda Base </w:t>
-      </w:r>
-      <w:proofErr w:type="spellStart"/>
-      <w:r>
-        <w:t>permanece</w:t>
+        <w:t xml:space="preserve">Sprint 4 y Sprint 5 permanecen cerrados. Sprint 6 permanece cerrado con 10/10 tareas Done, incluyendo HU-021/HU-022 Web, HU-023 expiración automática/continuidad y HU-024 notificaciones internas. HU-025 y HU-026 completaron posteriormente el cierre funcional del MVP Web. Sprint 7 está en progreso y ya tiene HU-027, HU-028 y HU-029 completadas e integradas a main: fundación Tauri, autenticación Desktop con cliente compartido y </w:t>
+      </w:r>
+      <w:proofErr w:type="spellStart"/>
+      <w:r>
+        <w:t>gestión</w:t>
       </w:r>
       <w:proofErr w:type="spellEnd"/>
       <w:r>
@@ -2547,95 +2643,15 @@
       </w:r>
       <w:proofErr w:type="spellStart"/>
       <w:r>
-        <w:t>cerrado</w:t>
-      </w:r>
-      <w:proofErr w:type="spellEnd"/>
-      <w:r>
-        <w:t xml:space="preserve"> con 8/8 </w:t>
-      </w:r>
-      <w:proofErr w:type="spellStart"/>
-      <w:r>
-        <w:t>tareas</w:t>
-      </w:r>
-      <w:proofErr w:type="spellEnd"/>
-      <w:r>
-        <w:t xml:space="preserve"> </w:t>
-      </w:r>
-      <w:proofErr w:type="spellStart"/>
-      <w:r>
-        <w:t>completadas</w:t>
-      </w:r>
-      <w:proofErr w:type="spellEnd"/>
-      <w:r>
-        <w:t xml:space="preserve">. Sprint 5: </w:t>
-      </w:r>
-      <w:proofErr w:type="spellStart"/>
-      <w:r>
-        <w:t>Citas</w:t>
-      </w:r>
-      <w:proofErr w:type="spellEnd"/>
-      <w:r>
-        <w:t xml:space="preserve"> y Lista de Espera </w:t>
-      </w:r>
-      <w:proofErr w:type="spellStart"/>
-      <w:r>
-        <w:t>permanece</w:t>
-      </w:r>
-      <w:proofErr w:type="spellEnd"/>
-      <w:r>
-        <w:t xml:space="preserve"> </w:t>
-      </w:r>
-      <w:proofErr w:type="spellStart"/>
-      <w:r>
-        <w:t>cerrado</w:t>
-      </w:r>
-      <w:proofErr w:type="spellEnd"/>
-      <w:r>
-        <w:t xml:space="preserve">. Sprint 6 </w:t>
-      </w:r>
-      <w:proofErr w:type="spellStart"/>
-      <w:r>
-        <w:t>permanece</w:t>
-      </w:r>
-      <w:proofErr w:type="spellEnd"/>
-      <w:r>
-        <w:t xml:space="preserve"> </w:t>
-      </w:r>
-      <w:proofErr w:type="spellStart"/>
-      <w:r>
-        <w:t>cerrado</w:t>
-      </w:r>
-      <w:proofErr w:type="spellEnd"/>
-      <w:r>
-        <w:t xml:space="preserve"> con 10/10 </w:t>
-      </w:r>
-      <w:proofErr w:type="spellStart"/>
-      <w:r>
-        <w:t>tareas</w:t>
-      </w:r>
-      <w:proofErr w:type="spellEnd"/>
-      <w:r>
-        <w:t xml:space="preserve"> Done, </w:t>
-      </w:r>
-      <w:proofErr w:type="spellStart"/>
-      <w:r>
-        <w:t>incluyendo</w:t>
-      </w:r>
-      <w:proofErr w:type="spellEnd"/>
-      <w:r>
-        <w:t xml:space="preserve"> HU-021/HU-022 Web, HU-023 </w:t>
-      </w:r>
-      <w:proofErr w:type="spellStart"/>
-      <w:r>
-        <w:t>expiración</w:t>
-      </w:r>
-      <w:proofErr w:type="spellEnd"/>
-      <w:r>
-        <w:t xml:space="preserve"> </w:t>
-      </w:r>
-      <w:proofErr w:type="spellStart"/>
-      <w:r>
-        <w:t>automática</w:t>
+        <w:t>institucional</w:t>
+      </w:r>
+      <w:proofErr w:type="spellEnd"/>
+      <w:r>
+        <w:t xml:space="preserve"> de </w:t>
+      </w:r>
+      <w:proofErr w:type="spellStart"/>
+      <w:r>
+        <w:t>sedes</w:t>
       </w:r>
       <w:proofErr w:type="spellEnd"/>
       <w:r>
@@ -2643,99 +2659,11 @@
       </w:r>
       <w:proofErr w:type="spellStart"/>
       <w:r>
-        <w:t>continuidad</w:t>
-      </w:r>
-      <w:proofErr w:type="spellEnd"/>
-      <w:r>
-        <w:t xml:space="preserve"> y HU-024 </w:t>
-      </w:r>
-      <w:proofErr w:type="spellStart"/>
-      <w:r>
-        <w:t>notificaciones</w:t>
-      </w:r>
-      <w:proofErr w:type="spellEnd"/>
-      <w:r>
-        <w:t xml:space="preserve"> </w:t>
-      </w:r>
-      <w:proofErr w:type="spellStart"/>
-      <w:r>
-        <w:t>internas</w:t>
-      </w:r>
-      <w:proofErr w:type="spellEnd"/>
-      <w:r>
-        <w:t xml:space="preserve">. Como </w:t>
-      </w:r>
-      <w:proofErr w:type="spellStart"/>
-      <w:r>
-        <w:t>cierre</w:t>
-      </w:r>
-      <w:proofErr w:type="spellEnd"/>
-      <w:r>
-        <w:t xml:space="preserve"> posterior de la </w:t>
-      </w:r>
-      <w:proofErr w:type="spellStart"/>
-      <w:r>
-        <w:t>experiencia</w:t>
-      </w:r>
-      <w:proofErr w:type="spellEnd"/>
-      <w:r>
-        <w:t xml:space="preserve"> Web, HU-025 y HU-026 también </w:t>
-      </w:r>
-      <w:proofErr w:type="spellStart"/>
-      <w:r>
-        <w:t>fueron</w:t>
-      </w:r>
-      <w:proofErr w:type="spellEnd"/>
-      <w:r>
-        <w:t xml:space="preserve"> </w:t>
-      </w:r>
-      <w:proofErr w:type="spellStart"/>
-      <w:r>
-        <w:t>completadas</w:t>
-      </w:r>
-      <w:proofErr w:type="spellEnd"/>
-      <w:r>
-        <w:t xml:space="preserve">, </w:t>
-      </w:r>
-      <w:proofErr w:type="spellStart"/>
-      <w:r>
-        <w:t>validadas</w:t>
-      </w:r>
-      <w:proofErr w:type="spellEnd"/>
-      <w:r>
-        <w:t xml:space="preserve"> y </w:t>
-      </w:r>
-      <w:proofErr w:type="spellStart"/>
-      <w:r>
-        <w:t>mergeadas</w:t>
-      </w:r>
-      <w:proofErr w:type="spellEnd"/>
-      <w:r>
-        <w:t xml:space="preserve"> a </w:t>
-      </w:r>
-      <w:proofErr w:type="gramStart"/>
-      <w:r>
-        <w:t>main antes</w:t>
-      </w:r>
-      <w:proofErr w:type="gramEnd"/>
-      <w:r>
-        <w:t xml:space="preserve"> de </w:t>
-      </w:r>
-      <w:proofErr w:type="spellStart"/>
-      <w:r>
-        <w:t>iniciar</w:t>
-      </w:r>
-      <w:proofErr w:type="spellEnd"/>
-      <w:r>
-        <w:t xml:space="preserve"> la </w:t>
-      </w:r>
-      <w:proofErr w:type="spellStart"/>
-      <w:r>
-        <w:t>etapa</w:t>
-      </w:r>
-      <w:proofErr w:type="spellEnd"/>
-      <w:r>
-        <w:t xml:space="preserve"> Desktop/Tauri.</w:t>
+        <w:t>servicios</w:t>
+      </w:r>
+      <w:proofErr w:type="spellEnd"/>
+      <w:r>
+        <w:t>.</w:t>
       </w:r>
     </w:p>
     <w:tbl>
@@ -2762,6 +2690,7 @@
       </w:tblGrid>
       <w:tr>
         <w:trPr>
+          <w:cantSplit/>
           <w:jc w:val="center"/>
         </w:trPr>
         <w:tc>
@@ -2773,12 +2702,17 @@
           <w:p>
             <w:proofErr w:type="spellStart"/>
             <w:r>
-              <w:t>Tareas</w:t>
+              <w:t>Historias</w:t>
             </w:r>
             <w:proofErr w:type="spellEnd"/>
             <w:r>
-              <w:t xml:space="preserve"> Sprint 6</w:t>
-            </w:r>
+              <w:t xml:space="preserve"> Sprint 7 </w:t>
+            </w:r>
+            <w:proofErr w:type="spellStart"/>
+            <w:r>
+              <w:t>refinadas</w:t>
+            </w:r>
+            <w:proofErr w:type="spellEnd"/>
           </w:p>
         </w:tc>
         <w:tc>
@@ -2843,6 +2777,7 @@
       </w:tr>
       <w:tr>
         <w:trPr>
+          <w:cantSplit/>
           <w:jc w:val="center"/>
         </w:trPr>
         <w:tc>
@@ -2852,7 +2787,7 @@
           </w:tcPr>
           <w:p>
             <w:r>
-              <w:t>10</w:t>
+              <w:t>3</w:t>
             </w:r>
           </w:p>
         </w:tc>
@@ -2863,7 +2798,7 @@
           </w:tcPr>
           <w:p>
             <w:r>
-              <w:t>10</w:t>
+              <w:t>3</w:t>
             </w:r>
           </w:p>
         </w:tc>
@@ -2874,7 +2809,7 @@
           </w:tcPr>
           <w:p>
             <w:r>
-              <w:t>0 / 0</w:t>
+              <w:t>0 / siguiente PBI por refinar</w:t>
             </w:r>
           </w:p>
         </w:tc>
@@ -2885,15 +2820,7 @@
           </w:tcPr>
           <w:p>
             <w:r>
-              <w:t xml:space="preserve">Sprint 6: 10/10 Done · Post-S6: HU-025 API 390/390 + E2E 8/8 · HU-026 Web 95/95 + </w:t>
-            </w:r>
-            <w:proofErr w:type="spellStart"/>
-            <w:r>
-              <w:t>fechas</w:t>
-            </w:r>
-            <w:proofErr w:type="spellEnd"/>
-            <w:r>
-              <w:t xml:space="preserve"> 10/10 + UI 16/16</w:t>
+              <w:t>HU-027 build/cargo PASS · HU-028 Web 95/95 + Desktop 7/7 + core 2/2 · HU-029 API 394/394 + E2E 15/15 + Desktop 16/16</w:t>
             </w:r>
           </w:p>
         </w:tc>
@@ -3780,6 +3707,7 @@
         <w:spacing w:after="40"/>
       </w:pPr>
       <w:r>
+        <w:lastRenderedPageBreak/>
         <w:t xml:space="preserve">HU-026 – </w:t>
       </w:r>
       <w:proofErr w:type="spellStart"/>
@@ -3933,6 +3861,63 @@
       <w:proofErr w:type="spellEnd"/>
       <w:r>
         <w:t>.</w:t>
+      </w:r>
+    </w:p>
+    <w:p>
+      <w:pPr>
+        <w:numPr>
+          <w:ilvl w:val="0"/>
+          <w:numId w:val="1"/>
+        </w:numPr>
+        <w:pBdr>
+          <w:top w:val="nil"/>
+          <w:left w:val="nil"/>
+          <w:bottom w:val="nil"/>
+          <w:right w:val="nil"/>
+          <w:between w:val="nil"/>
+        </w:pBdr>
+        <w:spacing w:after="40"/>
+      </w:pPr>
+      <w:r>
+        <w:t>HU-027 – Fundación Desktop/Tauri completada mediante PR #112 (merge 6adab82; commit 01ff1b1): se creó apps/desktop con Tauri 2 + React/Vite/TypeScript, shell institucional responsive y configuración nativa mínima. Build frontend, cargo check y ejecución Tauri fueron validados.</w:t>
+      </w:r>
+    </w:p>
+    <w:p>
+      <w:pPr>
+        <w:numPr>
+          <w:ilvl w:val="0"/>
+          <w:numId w:val="1"/>
+        </w:numPr>
+        <w:pBdr>
+          <w:top w:val="nil"/>
+          <w:left w:val="nil"/>
+          <w:bottom w:val="nil"/>
+          <w:right w:val="nil"/>
+          <w:between w:val="nil"/>
+        </w:pBdr>
+        <w:spacing w:after="40"/>
+      </w:pPr>
+      <w:r>
+        <w:t>HU-028 – Autenticación Desktop y cliente compartido completada mediante PR #113 (merge ae151b3; commit 46fb85f): @citajusta/client-core centraliza HTTP/sesión, Desktop usa transporte Tauri y tokens sólo en memoria. Validación: Web 95/95, Desktop 7/7, client-core 2/2, build/cargo PASS y login/logout manual real.</w:t>
+      </w:r>
+    </w:p>
+    <w:p>
+      <w:pPr>
+        <w:numPr>
+          <w:ilvl w:val="0"/>
+          <w:numId w:val="1"/>
+        </w:numPr>
+        <w:pBdr>
+          <w:top w:val="nil"/>
+          <w:left w:val="nil"/>
+          <w:bottom w:val="nil"/>
+          <w:right w:val="nil"/>
+          <w:between w:val="nil"/>
+        </w:pBdr>
+        <w:spacing w:after="40"/>
+      </w:pPr>
+      <w:r>
+        <w:t>HU-029 – Gestión institucional de sedes y servicios completada (commit f58c742; merge e1cdb2e): nuevas lecturas administrativas /branches/administration, /services/administration y /services/categories con permisos branches.read/services.read; Desktop permite crear, editar, activar/inactivar y asociar servicios a sedes. Validación: API 394/394, backend 34/34, E2E 15/15, Web 95/95, Desktop 16/16, client-core 4/4, Prisma/build/cargo/diff PASS y prueba manual Tauri/PostgreSQL completa.</w:t>
       </w:r>
     </w:p>
     <w:p>
@@ -3955,7 +3940,6 @@
       <w:bookmarkStart w:id="3" w:name="_heading=h.rdtewbq2v2wa" w:colFirst="0" w:colLast="0"/>
       <w:bookmarkEnd w:id="3"/>
       <w:r>
-        <w:lastRenderedPageBreak/>
         <w:t xml:space="preserve">5. </w:t>
       </w:r>
       <w:proofErr w:type="spellStart"/>
@@ -4013,6 +3997,22 @@
       </w:r>
       <w:proofErr w:type="spellStart"/>
       <w:r>
+        <w:t>el</w:t>
+      </w:r>
+      <w:proofErr w:type="spellEnd"/>
+      <w:r>
+        <w:t xml:space="preserve"> </w:t>
+      </w:r>
+      <w:proofErr w:type="spellStart"/>
+      <w:r>
+        <w:t>avance</w:t>
+      </w:r>
+      <w:proofErr w:type="spellEnd"/>
+      <w:r>
+        <w:t xml:space="preserve"> de Sprint 7 y </w:t>
+      </w:r>
+      <w:proofErr w:type="spellStart"/>
+      <w:r>
         <w:t>los</w:t>
       </w:r>
       <w:proofErr w:type="spellEnd"/>
@@ -4025,15 +4025,15 @@
       </w:r>
       <w:proofErr w:type="spellEnd"/>
       <w:r>
-        <w:t xml:space="preserve"> de HU-025 y HU-026 y con </w:t>
-      </w:r>
-      <w:proofErr w:type="spellStart"/>
-      <w:r>
-        <w:t>los</w:t>
-      </w:r>
-      <w:proofErr w:type="spellEnd"/>
-      <w:r>
-        <w:t xml:space="preserve"> merges PR #105/#107.</w:t>
+        <w:t xml:space="preserve"> </w:t>
+      </w:r>
+      <w:proofErr w:type="spellStart"/>
+      <w:r>
+        <w:t>verificables</w:t>
+      </w:r>
+      <w:proofErr w:type="spellEnd"/>
+      <w:r>
+        <w:t xml:space="preserve"> de HU-027, HU-028 y HU-029.</w:t>
       </w:r>
     </w:p>
     <w:p>
@@ -4051,43 +4051,11 @@
         </w:pBdr>
       </w:pPr>
       <w:r>
-        <w:t xml:space="preserve">Crear y </w:t>
-      </w:r>
-      <w:proofErr w:type="spellStart"/>
-      <w:r>
-        <w:t>refinar</w:t>
-      </w:r>
-      <w:proofErr w:type="spellEnd"/>
-      <w:r>
-        <w:t xml:space="preserve"> HU-027 para </w:t>
-      </w:r>
-      <w:proofErr w:type="spellStart"/>
-      <w:r>
-        <w:t>iniciar</w:t>
-      </w:r>
-      <w:proofErr w:type="spellEnd"/>
-      <w:r>
-        <w:t xml:space="preserve"> la </w:t>
-      </w:r>
-      <w:proofErr w:type="spellStart"/>
-      <w:r>
-        <w:t>fundación</w:t>
-      </w:r>
-      <w:proofErr w:type="spellEnd"/>
-      <w:r>
-        <w:t xml:space="preserve"> de la </w:t>
-      </w:r>
-      <w:proofErr w:type="spellStart"/>
-      <w:r>
-        <w:t>aplicación</w:t>
-      </w:r>
-      <w:proofErr w:type="spellEnd"/>
-      <w:r>
-        <w:t xml:space="preserve"> </w:t>
-      </w:r>
-      <w:proofErr w:type="spellStart"/>
-      <w:r>
-        <w:t>institucional</w:t>
+        <w:t xml:space="preserve">Refinar el siguiente PBI de Sprint 7 antes de incorporarlo al backlog; no documentar una nueva HU hasta definir su alcance y </w:t>
+      </w:r>
+      <w:proofErr w:type="spellStart"/>
+      <w:r>
+        <w:t>criterios</w:t>
       </w:r>
       <w:proofErr w:type="spellEnd"/>
       <w:r>
@@ -4095,27 +4063,11 @@
       </w:r>
       <w:proofErr w:type="spellStart"/>
       <w:r>
-        <w:t>escritorio</w:t>
-      </w:r>
-      <w:proofErr w:type="spellEnd"/>
-      <w:r>
-        <w:t xml:space="preserve"> con Tauri + React + TypeScript, </w:t>
-      </w:r>
-      <w:proofErr w:type="spellStart"/>
-      <w:r>
-        <w:t>consumiendo</w:t>
-      </w:r>
-      <w:proofErr w:type="spellEnd"/>
-      <w:r>
-        <w:t xml:space="preserve"> la </w:t>
-      </w:r>
-      <w:proofErr w:type="spellStart"/>
-      <w:r>
-        <w:t>misma</w:t>
-      </w:r>
-      <w:proofErr w:type="spellEnd"/>
-      <w:r>
-        <w:t xml:space="preserve"> API REST.</w:t>
+        <w:t>aceptación</w:t>
+      </w:r>
+      <w:proofErr w:type="spellEnd"/>
+      <w:r>
+        <w:t>.</w:t>
       </w:r>
     </w:p>
     <w:p>
@@ -4134,7 +4086,7 @@
       </w:pPr>
       <w:proofErr w:type="spellStart"/>
       <w:r>
-        <w:t>Conectar</w:t>
+        <w:t>Continuar</w:t>
       </w:r>
       <w:proofErr w:type="spellEnd"/>
       <w:r>
@@ -4142,6 +4094,14 @@
       </w:r>
       <w:proofErr w:type="spellStart"/>
       <w:r>
+        <w:t>conectando</w:t>
+      </w:r>
+      <w:proofErr w:type="spellEnd"/>
+      <w:r>
+        <w:t xml:space="preserve"> </w:t>
+      </w:r>
+      <w:proofErr w:type="spellStart"/>
+      <w:r>
         <w:t>progresivamente</w:t>
       </w:r>
       <w:proofErr w:type="spellEnd"/>
@@ -4166,7 +4126,7 @@
       </w:r>
       <w:proofErr w:type="spellStart"/>
       <w:r>
-        <w:t>administrativas</w:t>
+        <w:t>institucionales</w:t>
       </w:r>
       <w:proofErr w:type="spellEnd"/>
       <w:r>
@@ -4202,11 +4162,11 @@
       </w:r>
       <w:proofErr w:type="spellEnd"/>
       <w:r>
-        <w:t xml:space="preserve"> backend: </w:t>
-      </w:r>
-      <w:proofErr w:type="spellStart"/>
-      <w:r>
-        <w:t>sedes</w:t>
+        <w:t xml:space="preserve"> backend. </w:t>
+      </w:r>
+      <w:proofErr w:type="spellStart"/>
+      <w:r>
+        <w:t>Sedes</w:t>
       </w:r>
       <w:proofErr w:type="spellEnd"/>
       <w:r>
@@ -4218,11 +4178,51 @@
       </w:r>
       <w:proofErr w:type="spellEnd"/>
       <w:r>
+        <w:t xml:space="preserve"> </w:t>
+      </w:r>
+      <w:proofErr w:type="spellStart"/>
+      <w:r>
+        <w:t>ya</w:t>
+      </w:r>
+      <w:proofErr w:type="spellEnd"/>
+      <w:r>
+        <w:t xml:space="preserve"> </w:t>
+      </w:r>
+      <w:proofErr w:type="spellStart"/>
+      <w:r>
+        <w:t>está</w:t>
+      </w:r>
+      <w:proofErr w:type="spellEnd"/>
+      <w:r>
+        <w:t xml:space="preserve"> </w:t>
+      </w:r>
+      <w:proofErr w:type="spellStart"/>
+      <w:r>
+        <w:t>operativo</w:t>
+      </w:r>
+      <w:proofErr w:type="spellEnd"/>
+      <w:r>
+        <w:t xml:space="preserve">; </w:t>
+      </w:r>
+      <w:proofErr w:type="spellStart"/>
+      <w:r>
+        <w:t>profesionales</w:t>
+      </w:r>
+      <w:proofErr w:type="spellEnd"/>
+      <w:r>
         <w:t xml:space="preserve">, </w:t>
       </w:r>
       <w:proofErr w:type="spellStart"/>
       <w:r>
-        <w:t>profesionales</w:t>
+        <w:t>disponibilidad</w:t>
+      </w:r>
+      <w:proofErr w:type="spellEnd"/>
+      <w:r>
+        <w:t xml:space="preserve">, agenda, </w:t>
+      </w:r>
+      <w:proofErr w:type="spellStart"/>
+      <w:r>
+        <w:t>asistencia</w:t>
       </w:r>
       <w:proofErr w:type="spellEnd"/>
       <w:r>
@@ -4230,15 +4230,7 @@
       </w:r>
       <w:proofErr w:type="spellStart"/>
       <w:r>
-        <w:t>disponibilidad</w:t>
-      </w:r>
-      <w:proofErr w:type="spellEnd"/>
-      <w:r>
-        <w:t xml:space="preserve">, agenda, </w:t>
-      </w:r>
-      <w:proofErr w:type="spellStart"/>
-      <w:r>
-        <w:t>asistencia</w:t>
+        <w:t>reasignaciones</w:t>
       </w:r>
       <w:proofErr w:type="spellEnd"/>
       <w:r>
@@ -4246,14 +4238,6 @@
       </w:r>
       <w:proofErr w:type="spellStart"/>
       <w:r>
-        <w:t>reasignaciones</w:t>
-      </w:r>
-      <w:proofErr w:type="spellEnd"/>
-      <w:r>
-        <w:t xml:space="preserve">, </w:t>
-      </w:r>
-      <w:proofErr w:type="spellStart"/>
-      <w:r>
         <w:t>reportes</w:t>
       </w:r>
       <w:proofErr w:type="spellEnd"/>
@@ -4263,6 +4247,46 @@
       <w:proofErr w:type="spellStart"/>
       <w:r>
         <w:t>auditoría</w:t>
+      </w:r>
+      <w:proofErr w:type="spellEnd"/>
+      <w:r>
+        <w:t xml:space="preserve"> </w:t>
+      </w:r>
+      <w:proofErr w:type="spellStart"/>
+      <w:r>
+        <w:t>continúan</w:t>
+      </w:r>
+      <w:proofErr w:type="spellEnd"/>
+      <w:r>
+        <w:t xml:space="preserve"> </w:t>
+      </w:r>
+      <w:proofErr w:type="spellStart"/>
+      <w:r>
+        <w:t>como</w:t>
+      </w:r>
+      <w:proofErr w:type="spellEnd"/>
+      <w:r>
+        <w:t xml:space="preserve"> </w:t>
+      </w:r>
+      <w:proofErr w:type="spellStart"/>
+      <w:r>
+        <w:t>módulos</w:t>
+      </w:r>
+      <w:proofErr w:type="spellEnd"/>
+      <w:r>
+        <w:t xml:space="preserve"> posteriores </w:t>
+      </w:r>
+      <w:proofErr w:type="spellStart"/>
+      <w:r>
+        <w:t>sujetos</w:t>
+      </w:r>
+      <w:proofErr w:type="spellEnd"/>
+      <w:r>
+        <w:t xml:space="preserve"> a </w:t>
+      </w:r>
+      <w:proofErr w:type="spellStart"/>
+      <w:r>
+        <w:t>refinamiento</w:t>
       </w:r>
       <w:proofErr w:type="spellEnd"/>
       <w:r>
@@ -4780,157 +4804,30 @@
       <w:bookmarkStart w:id="5" w:name="_heading=h.b08mk4m6o44" w:colFirst="0" w:colLast="0"/>
       <w:bookmarkEnd w:id="5"/>
       <w:r>
+        <w:lastRenderedPageBreak/>
         <w:t>7. Release</w:t>
       </w:r>
     </w:p>
     <w:p/>
     <w:p>
       <w:r>
-        <w:t xml:space="preserve">El Release Plan </w:t>
-      </w:r>
-      <w:proofErr w:type="spellStart"/>
-      <w:r>
-        <w:t>mantiene</w:t>
-      </w:r>
-      <w:proofErr w:type="spellEnd"/>
-      <w:r>
-        <w:t xml:space="preserve"> 8 Sprints hasta R1.0. Sprint 6 </w:t>
-      </w:r>
-      <w:proofErr w:type="spellStart"/>
-      <w:r>
-        <w:t>permanece</w:t>
-      </w:r>
-      <w:proofErr w:type="spellEnd"/>
-      <w:r>
-        <w:t xml:space="preserve"> </w:t>
-      </w:r>
-      <w:proofErr w:type="spellStart"/>
-      <w:r>
-        <w:t>cerrado</w:t>
-      </w:r>
-      <w:proofErr w:type="spellEnd"/>
-      <w:r>
-        <w:t xml:space="preserve"> con </w:t>
-      </w:r>
-      <w:proofErr w:type="spellStart"/>
-      <w:r>
-        <w:t>el</w:t>
-      </w:r>
-      <w:proofErr w:type="spellEnd"/>
-      <w:r>
-        <w:t xml:space="preserve"> motor de </w:t>
-      </w:r>
-      <w:proofErr w:type="spellStart"/>
-      <w:r>
-        <w:t>reasignación</w:t>
-      </w:r>
-      <w:proofErr w:type="spellEnd"/>
-      <w:r>
-        <w:t xml:space="preserve">, </w:t>
-      </w:r>
-      <w:proofErr w:type="spellStart"/>
-      <w:r>
-        <w:t>expiración</w:t>
-      </w:r>
-      <w:proofErr w:type="spellEnd"/>
-      <w:r>
-        <w:t xml:space="preserve"> </w:t>
-      </w:r>
-      <w:proofErr w:type="spellStart"/>
-      <w:r>
-        <w:t>automática</w:t>
-      </w:r>
-      <w:proofErr w:type="spellEnd"/>
-      <w:r>
-        <w:t xml:space="preserve"> y </w:t>
-      </w:r>
-      <w:proofErr w:type="spellStart"/>
-      <w:r>
-        <w:t>notificaciones</w:t>
-      </w:r>
-      <w:proofErr w:type="spellEnd"/>
-      <w:r>
-        <w:t xml:space="preserve"> </w:t>
-      </w:r>
-      <w:proofErr w:type="spellStart"/>
-      <w:r>
-        <w:t>internas</w:t>
-      </w:r>
-      <w:proofErr w:type="spellEnd"/>
-      <w:r>
-        <w:t xml:space="preserve">. HU-025 (PR #105 → ea33e9f) y HU-026 (PR #107 → ec427a4) </w:t>
-      </w:r>
-      <w:proofErr w:type="spellStart"/>
-      <w:r>
-        <w:t>completaron</w:t>
-      </w:r>
-      <w:proofErr w:type="spellEnd"/>
-      <w:r>
-        <w:t xml:space="preserve"> </w:t>
-      </w:r>
-      <w:proofErr w:type="spellStart"/>
-      <w:r>
-        <w:t>el</w:t>
-      </w:r>
-      <w:proofErr w:type="spellEnd"/>
-      <w:r>
-        <w:t xml:space="preserve"> </w:t>
-      </w:r>
-      <w:proofErr w:type="spellStart"/>
-      <w:r>
-        <w:t>cierre</w:t>
-      </w:r>
-      <w:proofErr w:type="spellEnd"/>
-      <w:r>
-        <w:t xml:space="preserve"> </w:t>
-      </w:r>
-      <w:proofErr w:type="spellStart"/>
-      <w:r>
-        <w:t>funcional</w:t>
-      </w:r>
-      <w:proofErr w:type="spellEnd"/>
-      <w:r>
-        <w:t xml:space="preserve"> del MVP Web. El </w:t>
-      </w:r>
-      <w:proofErr w:type="spellStart"/>
-      <w:r>
-        <w:t>siguiente</w:t>
-      </w:r>
-      <w:proofErr w:type="spellEnd"/>
-      <w:r>
-        <w:t xml:space="preserve"> </w:t>
-      </w:r>
-      <w:proofErr w:type="spellStart"/>
-      <w:r>
-        <w:t>foco</w:t>
-      </w:r>
-      <w:proofErr w:type="spellEnd"/>
-      <w:r>
-        <w:t xml:space="preserve"> </w:t>
-      </w:r>
-      <w:proofErr w:type="spellStart"/>
-      <w:r>
-        <w:t>corresponde</w:t>
-      </w:r>
-      <w:proofErr w:type="spellEnd"/>
-      <w:r>
-        <w:t xml:space="preserve"> a Sprint 7: </w:t>
-      </w:r>
-      <w:proofErr w:type="spellStart"/>
-      <w:r>
-        <w:t>aplicación</w:t>
-      </w:r>
-      <w:proofErr w:type="spellEnd"/>
-      <w:r>
-        <w:t xml:space="preserve"> </w:t>
-      </w:r>
-      <w:proofErr w:type="spellStart"/>
-      <w:r>
-        <w:t>institucional</w:t>
-      </w:r>
-      <w:proofErr w:type="spellEnd"/>
-      <w:r>
-        <w:t xml:space="preserve"> Desktop/Tauri.</w:t>
+        <w:t xml:space="preserve">El Release Plan mantiene 8 Sprints hasta R1.0. Sprint 6 permanece cerrado y el MVP Web quedó funcionalmente cerrado con HU-025/HU-026. Sprint 7 está en progreso: HU-027 creó la fundación Tauri (PR #112 → 6adab82), HU-028 incorporó autenticación Desktop y @citajusta/client-core (PR #113 → ae151b3), y HU-029 entregó gestión institucional de </w:t>
+      </w:r>
+      <w:proofErr w:type="spellStart"/>
+      <w:r>
+        <w:t>sedes</w:t>
+      </w:r>
+      <w:proofErr w:type="spellEnd"/>
+      <w:r>
+        <w:t>/</w:t>
+      </w:r>
+      <w:proofErr w:type="spellStart"/>
+      <w:r>
+        <w:t>servicios</w:t>
+      </w:r>
+      <w:proofErr w:type="spellEnd"/>
+      <w:r>
+        <w:t xml:space="preserve"> (f58c742 → e1cdb2e).</w:t>
       </w:r>
     </w:p>
     <w:p/>
@@ -4946,151 +4843,15 @@
     </w:p>
     <w:p>
       <w:r>
-        <w:t xml:space="preserve">Estado: </w:t>
-      </w:r>
-      <w:proofErr w:type="spellStart"/>
-      <w:r>
-        <w:t>tablero</w:t>
-      </w:r>
-      <w:proofErr w:type="spellEnd"/>
-      <w:r>
-        <w:t xml:space="preserve"> real disponible </w:t>
-      </w:r>
-      <w:proofErr w:type="spellStart"/>
-      <w:r>
-        <w:t>en</w:t>
-      </w:r>
-      <w:proofErr w:type="spellEnd"/>
-      <w:r>
-        <w:t xml:space="preserve"> GitHub Projects con columnas Backlog, Ready, In Progress, Review, Testing y Done. HU-021 a HU-026 </w:t>
-      </w:r>
-      <w:proofErr w:type="spellStart"/>
-      <w:r>
-        <w:t>están</w:t>
+        <w:t xml:space="preserve">Estado: tablero real disponible en GitHub Projects con columnas Backlog, Ready, In Progress, Review, Testing y Done. HU-021 a HU-029 están completadas e integradas a main. HU-027, HU-028 y HU-029 fueron movidas a Done tras validación y merge. La evidencia visual histórica se conserva y el estado actual queda respaldado por merges y </w:t>
+      </w:r>
+      <w:proofErr w:type="spellStart"/>
+      <w:r>
+        <w:t>el</w:t>
       </w:r>
       <w:proofErr w:type="spellEnd"/>
       <w:r>
         <w:t xml:space="preserve"> </w:t>
-      </w:r>
-      <w:proofErr w:type="spellStart"/>
-      <w:r>
-        <w:t>completadas</w:t>
-      </w:r>
-      <w:proofErr w:type="spellEnd"/>
-      <w:r>
-        <w:t xml:space="preserve"> e </w:t>
-      </w:r>
-      <w:proofErr w:type="spellStart"/>
-      <w:r>
-        <w:t>integradas</w:t>
-      </w:r>
-      <w:proofErr w:type="spellEnd"/>
-      <w:r>
-        <w:t xml:space="preserve"> a main; HU-025 </w:t>
-      </w:r>
-      <w:proofErr w:type="spellStart"/>
-      <w:r>
-        <w:t>fue</w:t>
-      </w:r>
-      <w:proofErr w:type="spellEnd"/>
-      <w:r>
-        <w:t xml:space="preserve"> </w:t>
-      </w:r>
-      <w:proofErr w:type="spellStart"/>
-      <w:r>
-        <w:t>movida</w:t>
-      </w:r>
-      <w:proofErr w:type="spellEnd"/>
-      <w:r>
-        <w:t xml:space="preserve"> a Done </w:t>
-      </w:r>
-      <w:proofErr w:type="spellStart"/>
-      <w:r>
-        <w:t>tras</w:t>
-      </w:r>
-      <w:proofErr w:type="spellEnd"/>
-      <w:r>
-        <w:t xml:space="preserve"> PR #105 y HU-026 </w:t>
-      </w:r>
-      <w:proofErr w:type="spellStart"/>
-      <w:r>
-        <w:t>tras</w:t>
-      </w:r>
-      <w:proofErr w:type="spellEnd"/>
-      <w:r>
-        <w:t xml:space="preserve"> PR #107. La </w:t>
-      </w:r>
-      <w:proofErr w:type="spellStart"/>
-      <w:r>
-        <w:t>evidencia</w:t>
-      </w:r>
-      <w:proofErr w:type="spellEnd"/>
-      <w:r>
-        <w:t xml:space="preserve"> visual </w:t>
-      </w:r>
-      <w:proofErr w:type="spellStart"/>
-      <w:r>
-        <w:t>histórica</w:t>
-      </w:r>
-      <w:proofErr w:type="spellEnd"/>
-      <w:r>
-        <w:t xml:space="preserve"> se </w:t>
-      </w:r>
-      <w:proofErr w:type="spellStart"/>
-      <w:r>
-        <w:t>conserva</w:t>
-      </w:r>
-      <w:proofErr w:type="spellEnd"/>
-      <w:r>
-        <w:t xml:space="preserve"> y </w:t>
-      </w:r>
-      <w:proofErr w:type="spellStart"/>
-      <w:r>
-        <w:t>el</w:t>
-      </w:r>
-      <w:proofErr w:type="spellEnd"/>
-      <w:r>
-        <w:t xml:space="preserve"> </w:t>
-      </w:r>
-      <w:proofErr w:type="spellStart"/>
-      <w:r>
-        <w:t>cierre</w:t>
-      </w:r>
-      <w:proofErr w:type="spellEnd"/>
-      <w:r>
-        <w:t xml:space="preserve"> actual </w:t>
-      </w:r>
-      <w:proofErr w:type="spellStart"/>
-      <w:r>
-        <w:t>queda</w:t>
-      </w:r>
-      <w:proofErr w:type="spellEnd"/>
-      <w:r>
-        <w:t xml:space="preserve"> </w:t>
-      </w:r>
-      <w:proofErr w:type="spellStart"/>
-      <w:r>
-        <w:t>respaldado</w:t>
-      </w:r>
-      <w:proofErr w:type="spellEnd"/>
-      <w:r>
-        <w:t xml:space="preserve"> </w:t>
-      </w:r>
-      <w:proofErr w:type="spellStart"/>
-      <w:r>
-        <w:t>por</w:t>
-      </w:r>
-      <w:proofErr w:type="spellEnd"/>
-      <w:r>
-        <w:t xml:space="preserve"> merges y </w:t>
-      </w:r>
-      <w:proofErr w:type="spellStart"/>
-      <w:r>
-        <w:t>estado</w:t>
-      </w:r>
-      <w:proofErr w:type="spellEnd"/>
-      <w:r>
-        <w:t xml:space="preserve"> del </w:t>
       </w:r>
       <w:proofErr w:type="spellStart"/>
       <w:r>
@@ -5105,7 +4866,6 @@
     <w:p>
       <w:proofErr w:type="spellStart"/>
       <w:r>
-        <w:lastRenderedPageBreak/>
         <w:t>Figura</w:t>
       </w:r>
       <w:proofErr w:type="spellEnd"/>
@@ -5208,111 +4968,7 @@
         </w:pBdr>
       </w:pPr>
       <w:r>
-        <w:t xml:space="preserve">No </w:t>
-      </w:r>
-      <w:proofErr w:type="spellStart"/>
-      <w:r>
-        <w:t>existe</w:t>
-      </w:r>
-      <w:proofErr w:type="spellEnd"/>
-      <w:r>
-        <w:t xml:space="preserve"> </w:t>
-      </w:r>
-      <w:proofErr w:type="spellStart"/>
-      <w:r>
-        <w:t>actualmente</w:t>
-      </w:r>
-      <w:proofErr w:type="spellEnd"/>
-      <w:r>
-        <w:t xml:space="preserve"> un </w:t>
-      </w:r>
-      <w:proofErr w:type="spellStart"/>
-      <w:r>
-        <w:t>bloqueo</w:t>
-      </w:r>
-      <w:proofErr w:type="spellEnd"/>
-      <w:r>
-        <w:t xml:space="preserve"> </w:t>
-      </w:r>
-      <w:proofErr w:type="spellStart"/>
-      <w:r>
-        <w:t>técnico</w:t>
-      </w:r>
-      <w:proofErr w:type="spellEnd"/>
-      <w:r>
-        <w:t xml:space="preserve"> </w:t>
-      </w:r>
-      <w:proofErr w:type="spellStart"/>
-      <w:r>
-        <w:t>activo</w:t>
-      </w:r>
-      <w:proofErr w:type="spellEnd"/>
-      <w:r>
-        <w:t xml:space="preserve"> </w:t>
-      </w:r>
-      <w:proofErr w:type="spellStart"/>
-      <w:r>
-        <w:t>en</w:t>
-      </w:r>
-      <w:proofErr w:type="spellEnd"/>
-      <w:r>
-        <w:t xml:space="preserve"> </w:t>
-      </w:r>
-      <w:proofErr w:type="spellStart"/>
-      <w:r>
-        <w:t>persistencia</w:t>
-      </w:r>
-      <w:proofErr w:type="spellEnd"/>
-      <w:r>
-        <w:t xml:space="preserve">, Prisma, Web, </w:t>
-      </w:r>
-      <w:proofErr w:type="spellStart"/>
-      <w:r>
-        <w:t>reasignación</w:t>
-      </w:r>
-      <w:proofErr w:type="spellEnd"/>
-      <w:r>
-        <w:t xml:space="preserve"> </w:t>
-      </w:r>
-      <w:proofErr w:type="spellStart"/>
-      <w:r>
-        <w:t>automática</w:t>
-      </w:r>
-      <w:proofErr w:type="spellEnd"/>
-      <w:r>
-        <w:t xml:space="preserve"> o </w:t>
-      </w:r>
-      <w:proofErr w:type="spellStart"/>
-      <w:r>
-        <w:t>notificaciones</w:t>
-      </w:r>
-      <w:proofErr w:type="spellEnd"/>
-      <w:r>
-        <w:t xml:space="preserve"> </w:t>
-      </w:r>
-      <w:proofErr w:type="spellStart"/>
-      <w:r>
-        <w:t>internas</w:t>
-      </w:r>
-      <w:proofErr w:type="spellEnd"/>
-      <w:r>
-        <w:t xml:space="preserve">. HU-025 y HU-026 </w:t>
-      </w:r>
-      <w:proofErr w:type="spellStart"/>
-      <w:r>
-        <w:t>fueron</w:t>
-      </w:r>
-      <w:proofErr w:type="spellEnd"/>
-      <w:r>
-        <w:t xml:space="preserve"> </w:t>
-      </w:r>
-      <w:proofErr w:type="spellStart"/>
-      <w:r>
-        <w:t>validadas</w:t>
-      </w:r>
-      <w:proofErr w:type="spellEnd"/>
-      <w:r>
-        <w:t xml:space="preserve"> y </w:t>
+        <w:t xml:space="preserve">No existe actualmente un bloqueo técnico activo en persistencia, Prisma, Web ni en la fundación Desktop. HU-027 a HU-029 fueron validadas y </w:t>
       </w:r>
       <w:proofErr w:type="spellStart"/>
       <w:r>
@@ -5338,131 +4994,11 @@
         </w:pBdr>
       </w:pPr>
       <w:r>
-        <w:t xml:space="preserve">El MVP Web de </w:t>
-      </w:r>
-      <w:proofErr w:type="spellStart"/>
-      <w:r>
-        <w:t>usuario</w:t>
-      </w:r>
-      <w:proofErr w:type="spellEnd"/>
-      <w:r>
-        <w:t xml:space="preserve"> </w:t>
-      </w:r>
-      <w:proofErr w:type="spellStart"/>
-      <w:r>
-        <w:t>queda</w:t>
-      </w:r>
-      <w:proofErr w:type="spellEnd"/>
-      <w:r>
-        <w:t xml:space="preserve"> </w:t>
-      </w:r>
-      <w:proofErr w:type="spellStart"/>
-      <w:r>
-        <w:t>funcionalmente</w:t>
-      </w:r>
-      <w:proofErr w:type="spellEnd"/>
-      <w:r>
-        <w:t xml:space="preserve"> </w:t>
-      </w:r>
-      <w:proofErr w:type="spellStart"/>
-      <w:r>
-        <w:t>cerrado</w:t>
-      </w:r>
-      <w:proofErr w:type="spellEnd"/>
-      <w:r>
-        <w:t xml:space="preserve"> </w:t>
-      </w:r>
-      <w:proofErr w:type="spellStart"/>
-      <w:r>
-        <w:t>frente</w:t>
-      </w:r>
-      <w:proofErr w:type="spellEnd"/>
-      <w:r>
-        <w:t xml:space="preserve"> al </w:t>
-      </w:r>
-      <w:proofErr w:type="spellStart"/>
-      <w:r>
-        <w:t>alcance</w:t>
-      </w:r>
-      <w:proofErr w:type="spellEnd"/>
-      <w:r>
-        <w:t xml:space="preserve"> </w:t>
-      </w:r>
-      <w:proofErr w:type="spellStart"/>
-      <w:r>
-        <w:t>revisado</w:t>
-      </w:r>
-      <w:proofErr w:type="spellEnd"/>
-      <w:r>
-        <w:t xml:space="preserve">: </w:t>
-      </w:r>
-      <w:proofErr w:type="spellStart"/>
-      <w:r>
-        <w:t>búsqueda</w:t>
-      </w:r>
-      <w:proofErr w:type="spellEnd"/>
-      <w:r>
-        <w:t xml:space="preserve"> flexible/</w:t>
-      </w:r>
-      <w:proofErr w:type="spellStart"/>
-      <w:r>
-        <w:t>fecha</w:t>
-      </w:r>
-      <w:proofErr w:type="spellEnd"/>
-      <w:r>
-        <w:t xml:space="preserve"> </w:t>
-      </w:r>
-      <w:proofErr w:type="spellStart"/>
-      <w:r>
-        <w:t>específica</w:t>
-      </w:r>
-      <w:proofErr w:type="spellEnd"/>
-      <w:r>
-        <w:t xml:space="preserve">, </w:t>
-      </w:r>
-      <w:proofErr w:type="spellStart"/>
-      <w:r>
-        <w:t>reserva</w:t>
-      </w:r>
-      <w:proofErr w:type="spellEnd"/>
-      <w:r>
-        <w:t xml:space="preserve">, Mis </w:t>
-      </w:r>
-      <w:proofErr w:type="spellStart"/>
-      <w:r>
-        <w:t>citas</w:t>
-      </w:r>
-      <w:proofErr w:type="spellEnd"/>
-      <w:r>
-        <w:t xml:space="preserve">, </w:t>
-      </w:r>
-      <w:proofErr w:type="spellStart"/>
-      <w:r>
-        <w:t>cancelación</w:t>
-      </w:r>
-      <w:proofErr w:type="spellEnd"/>
-      <w:r>
-        <w:t xml:space="preserve">, </w:t>
-      </w:r>
-      <w:proofErr w:type="spellStart"/>
-      <w:r>
-        <w:t>lista</w:t>
-      </w:r>
-      <w:proofErr w:type="spellEnd"/>
-      <w:r>
-        <w:t xml:space="preserve"> de </w:t>
-      </w:r>
-      <w:proofErr w:type="spellStart"/>
-      <w:r>
-        <w:t>espera</w:t>
-      </w:r>
-      <w:proofErr w:type="spellEnd"/>
-      <w:r>
-        <w:t xml:space="preserve">, </w:t>
-      </w:r>
-      <w:proofErr w:type="spellStart"/>
-      <w:r>
-        <w:t>ofertas</w:t>
+        <w:t xml:space="preserve">El MVP Web de usuario permanece funcionalmente cerrado. La aplicación institucional de escritorio ya fue iniciada y cuenta con autenticación real y un primer módulo funcional de administración de </w:t>
+      </w:r>
+      <w:proofErr w:type="spellStart"/>
+      <w:r>
+        <w:t>sedes</w:t>
       </w:r>
       <w:proofErr w:type="spellEnd"/>
       <w:r>
@@ -5470,63 +5006,7 @@
       </w:r>
       <w:proofErr w:type="spellStart"/>
       <w:r>
-        <w:t>notificaciones</w:t>
-      </w:r>
-      <w:proofErr w:type="spellEnd"/>
-      <w:r>
-        <w:t xml:space="preserve">. La </w:t>
-      </w:r>
-      <w:proofErr w:type="spellStart"/>
-      <w:r>
-        <w:t>siguiente</w:t>
-      </w:r>
-      <w:proofErr w:type="spellEnd"/>
-      <w:r>
-        <w:t xml:space="preserve"> </w:t>
-      </w:r>
-      <w:proofErr w:type="spellStart"/>
-      <w:r>
-        <w:t>prioridad</w:t>
-      </w:r>
-      <w:proofErr w:type="spellEnd"/>
-      <w:r>
-        <w:t xml:space="preserve"> </w:t>
-      </w:r>
-      <w:proofErr w:type="spellStart"/>
-      <w:r>
-        <w:t>funcional</w:t>
-      </w:r>
-      <w:proofErr w:type="spellEnd"/>
-      <w:r>
-        <w:t xml:space="preserve"> es </w:t>
-      </w:r>
-      <w:proofErr w:type="spellStart"/>
-      <w:r>
-        <w:t>iniciar</w:t>
-      </w:r>
-      <w:proofErr w:type="spellEnd"/>
-      <w:r>
-        <w:t xml:space="preserve"> la </w:t>
-      </w:r>
-      <w:proofErr w:type="spellStart"/>
-      <w:r>
-        <w:t>aplicación</w:t>
-      </w:r>
-      <w:proofErr w:type="spellEnd"/>
-      <w:r>
-        <w:t xml:space="preserve"> </w:t>
-      </w:r>
-      <w:proofErr w:type="spellStart"/>
-      <w:r>
-        <w:t>institucional</w:t>
-      </w:r>
-      <w:proofErr w:type="spellEnd"/>
-      <w:r>
-        <w:t xml:space="preserve"> de </w:t>
-      </w:r>
-      <w:proofErr w:type="spellStart"/>
-      <w:r>
-        <w:t>escritorio</w:t>
+        <w:t>servicios</w:t>
       </w:r>
       <w:proofErr w:type="spellEnd"/>
       <w:r>
@@ -5548,11 +5028,11 @@
         </w:pBdr>
       </w:pPr>
       <w:r>
-        <w:t xml:space="preserve">La </w:t>
-      </w:r>
-      <w:proofErr w:type="spellStart"/>
-      <w:r>
-        <w:t>aplicación</w:t>
+        <w:t xml:space="preserve">Desktop/Tauri ya está operativo como cliente institucional. Permanecen pendientes los siguientes módulos Desktop y Docker/Docker Compose </w:t>
+      </w:r>
+      <w:proofErr w:type="spellStart"/>
+      <w:r>
+        <w:t>como</w:t>
       </w:r>
       <w:proofErr w:type="spellEnd"/>
       <w:r>
@@ -5560,15 +5040,7 @@
       </w:r>
       <w:proofErr w:type="spellStart"/>
       <w:r>
-        <w:t>institucional</w:t>
-      </w:r>
-      <w:proofErr w:type="spellEnd"/>
-      <w:r>
-        <w:t xml:space="preserve"> Tauri y Docker/Docker Compose </w:t>
-      </w:r>
-      <w:proofErr w:type="spellStart"/>
-      <w:r>
-        <w:t>continúan</w:t>
+        <w:t>entregables</w:t>
       </w:r>
       <w:proofErr w:type="spellEnd"/>
       <w:r>
@@ -5576,67 +5048,11 @@
       </w:r>
       <w:proofErr w:type="spellStart"/>
       <w:r>
-        <w:t>pendientes</w:t>
-      </w:r>
-      <w:proofErr w:type="spellEnd"/>
-      <w:r>
-        <w:t xml:space="preserve"> </w:t>
-      </w:r>
-      <w:proofErr w:type="spellStart"/>
-      <w:r>
-        <w:t>como</w:t>
-      </w:r>
-      <w:proofErr w:type="spellEnd"/>
-      <w:r>
-        <w:t xml:space="preserve"> </w:t>
-      </w:r>
-      <w:proofErr w:type="spellStart"/>
-      <w:r>
-        <w:t>entregables</w:t>
-      </w:r>
-      <w:proofErr w:type="spellEnd"/>
-      <w:r>
-        <w:t xml:space="preserve"> </w:t>
-      </w:r>
-      <w:proofErr w:type="spellStart"/>
-      <w:r>
         <w:t>técnicos</w:t>
       </w:r>
       <w:proofErr w:type="spellEnd"/>
       <w:r>
-        <w:t xml:space="preserve"> posteriores; Tauri es </w:t>
-      </w:r>
-      <w:proofErr w:type="spellStart"/>
-      <w:r>
-        <w:t>el</w:t>
-      </w:r>
-      <w:proofErr w:type="spellEnd"/>
-      <w:r>
-        <w:t xml:space="preserve"> </w:t>
-      </w:r>
-      <w:proofErr w:type="spellStart"/>
-      <w:r>
-        <w:t>siguiente</w:t>
-      </w:r>
-      <w:proofErr w:type="spellEnd"/>
-      <w:r>
-        <w:t xml:space="preserve"> </w:t>
-      </w:r>
-      <w:proofErr w:type="spellStart"/>
-      <w:r>
-        <w:t>bloque</w:t>
-      </w:r>
-      <w:proofErr w:type="spellEnd"/>
-      <w:r>
-        <w:t xml:space="preserve"> de </w:t>
-      </w:r>
-      <w:proofErr w:type="spellStart"/>
-      <w:r>
-        <w:t>implementación</w:t>
-      </w:r>
-      <w:proofErr w:type="spellEnd"/>
-      <w:r>
-        <w:t>.</w:t>
+        <w:t xml:space="preserve"> posteriores.</w:t>
       </w:r>
     </w:p>
     <w:p>
@@ -5849,6 +5265,7 @@
       </w:tblGrid>
       <w:tr>
         <w:trPr>
+          <w:cantSplit/>
           <w:jc w:val="center"/>
         </w:trPr>
         <w:tc>
@@ -5937,6 +5354,7 @@
       </w:tr>
       <w:tr>
         <w:trPr>
+          <w:cantSplit/>
           <w:jc w:val="center"/>
         </w:trPr>
         <w:tc>
@@ -5977,6 +5395,7 @@
       </w:tr>
       <w:tr>
         <w:trPr>
+          <w:cantSplit/>
           <w:jc w:val="center"/>
         </w:trPr>
         <w:tc>
@@ -6017,6 +5436,7 @@
       </w:tr>
       <w:tr>
         <w:trPr>
+          <w:cantSplit/>
           <w:jc w:val="center"/>
         </w:trPr>
         <w:tc>
@@ -6057,6 +5477,7 @@
       </w:tr>
       <w:tr>
         <w:trPr>
+          <w:cantSplit/>
           <w:jc w:val="center"/>
         </w:trPr>
         <w:tc>
@@ -6100,6 +5521,7 @@
       </w:tr>
       <w:tr>
         <w:trPr>
+          <w:cantSplit/>
           <w:jc w:val="center"/>
         </w:trPr>
         <w:tc>
@@ -6109,6 +5531,7 @@
           </w:tcPr>
           <w:p>
             <w:r>
+              <w:lastRenderedPageBreak/>
               <w:t>Kanban</w:t>
             </w:r>
           </w:p>
@@ -6164,239 +5587,7 @@
     </w:p>
     <w:p>
       <w:r>
-        <w:t xml:space="preserve">La </w:t>
-      </w:r>
-      <w:proofErr w:type="spellStart"/>
-      <w:r>
-        <w:t>revisión</w:t>
-      </w:r>
-      <w:proofErr w:type="spellEnd"/>
-      <w:r>
-        <w:t xml:space="preserve"> actual </w:t>
-      </w:r>
-      <w:proofErr w:type="spellStart"/>
-      <w:r>
-        <w:t>evidencia</w:t>
-      </w:r>
-      <w:proofErr w:type="spellEnd"/>
-      <w:r>
-        <w:t xml:space="preserve"> </w:t>
-      </w:r>
-      <w:proofErr w:type="spellStart"/>
-      <w:r>
-        <w:t>que</w:t>
-      </w:r>
-      <w:proofErr w:type="spellEnd"/>
-      <w:r>
-        <w:t xml:space="preserve"> </w:t>
-      </w:r>
-      <w:proofErr w:type="spellStart"/>
-      <w:r>
-        <w:t>CitaJusta</w:t>
-      </w:r>
-      <w:proofErr w:type="spellEnd"/>
-      <w:r>
-        <w:t xml:space="preserve"> </w:t>
-      </w:r>
-      <w:proofErr w:type="spellStart"/>
-      <w:r>
-        <w:t>cuenta</w:t>
-      </w:r>
-      <w:proofErr w:type="spellEnd"/>
-      <w:r>
-        <w:t xml:space="preserve"> con backend HU-001 a HU-020 </w:t>
-      </w:r>
-      <w:proofErr w:type="spellStart"/>
-      <w:r>
-        <w:t>implementado</w:t>
-      </w:r>
-      <w:proofErr w:type="spellEnd"/>
-      <w:r>
-        <w:t xml:space="preserve"> y con HU-021 a HU-026 </w:t>
-      </w:r>
-      <w:proofErr w:type="spellStart"/>
-      <w:r>
-        <w:t>cerradas</w:t>
-      </w:r>
-      <w:proofErr w:type="spellEnd"/>
-      <w:r>
-        <w:t xml:space="preserve"> e </w:t>
-      </w:r>
-      <w:proofErr w:type="spellStart"/>
-      <w:r>
-        <w:t>integradas</w:t>
-      </w:r>
-      <w:proofErr w:type="spellEnd"/>
-      <w:r>
-        <w:t xml:space="preserve">. HU-025 </w:t>
-      </w:r>
-      <w:proofErr w:type="spellStart"/>
-      <w:r>
-        <w:t>completó</w:t>
-      </w:r>
-      <w:proofErr w:type="spellEnd"/>
-      <w:r>
-        <w:t xml:space="preserve"> </w:t>
-      </w:r>
-      <w:proofErr w:type="spellStart"/>
-      <w:r>
-        <w:t>el</w:t>
-      </w:r>
-      <w:proofErr w:type="spellEnd"/>
-      <w:r>
-        <w:t xml:space="preserve"> </w:t>
-      </w:r>
-      <w:proofErr w:type="spellStart"/>
-      <w:r>
-        <w:t>disparo</w:t>
-      </w:r>
-      <w:proofErr w:type="spellEnd"/>
-      <w:r>
-        <w:t xml:space="preserve"> </w:t>
-      </w:r>
-      <w:proofErr w:type="spellStart"/>
-      <w:r>
-        <w:t>automático</w:t>
-      </w:r>
-      <w:proofErr w:type="spellEnd"/>
-      <w:r>
-        <w:t xml:space="preserve"> de </w:t>
-      </w:r>
-      <w:proofErr w:type="spellStart"/>
-      <w:r>
-        <w:t>reasignación</w:t>
-      </w:r>
-      <w:proofErr w:type="spellEnd"/>
-      <w:r>
-        <w:t xml:space="preserve"> al </w:t>
-      </w:r>
-      <w:proofErr w:type="spellStart"/>
-      <w:r>
-        <w:t>cancelar</w:t>
-      </w:r>
-      <w:proofErr w:type="spellEnd"/>
-      <w:r>
-        <w:t xml:space="preserve"> y HU-026 </w:t>
-      </w:r>
-      <w:proofErr w:type="spellStart"/>
-      <w:r>
-        <w:t>cerró</w:t>
-      </w:r>
-      <w:proofErr w:type="spellEnd"/>
-      <w:r>
-        <w:t xml:space="preserve"> la </w:t>
-      </w:r>
-      <w:proofErr w:type="spellStart"/>
-      <w:r>
-        <w:t>búsqueda</w:t>
-      </w:r>
-      <w:proofErr w:type="spellEnd"/>
-      <w:r>
-        <w:t xml:space="preserve"> Web </w:t>
-      </w:r>
-      <w:proofErr w:type="spellStart"/>
-      <w:r>
-        <w:t>por</w:t>
-      </w:r>
-      <w:proofErr w:type="spellEnd"/>
-      <w:r>
-        <w:t xml:space="preserve"> </w:t>
-      </w:r>
-      <w:proofErr w:type="spellStart"/>
-      <w:r>
-        <w:t>fecha</w:t>
-      </w:r>
-      <w:proofErr w:type="spellEnd"/>
-      <w:r>
-        <w:t xml:space="preserve"> </w:t>
-      </w:r>
-      <w:proofErr w:type="spellStart"/>
-      <w:r>
-        <w:t>específica</w:t>
-      </w:r>
-      <w:proofErr w:type="spellEnd"/>
-      <w:r>
-        <w:t xml:space="preserve">/flexible. Los merges </w:t>
-      </w:r>
-      <w:proofErr w:type="spellStart"/>
-      <w:r>
-        <w:t>recientes</w:t>
-      </w:r>
-      <w:proofErr w:type="spellEnd"/>
-      <w:r>
-        <w:t xml:space="preserve"> son PR #105 → ea33e9f y PR #107 → ec427a4. El MVP Web </w:t>
-      </w:r>
-      <w:proofErr w:type="spellStart"/>
-      <w:r>
-        <w:t>queda</w:t>
-      </w:r>
-      <w:proofErr w:type="spellEnd"/>
-      <w:r>
-        <w:t xml:space="preserve"> </w:t>
-      </w:r>
-      <w:proofErr w:type="spellStart"/>
-      <w:r>
-        <w:t>funcionalmente</w:t>
-      </w:r>
-      <w:proofErr w:type="spellEnd"/>
-      <w:r>
-        <w:t xml:space="preserve"> </w:t>
-      </w:r>
-      <w:proofErr w:type="spellStart"/>
-      <w:r>
-        <w:t>cerrado</w:t>
-      </w:r>
-      <w:proofErr w:type="spellEnd"/>
-      <w:r>
-        <w:t xml:space="preserve"> y </w:t>
-      </w:r>
-      <w:proofErr w:type="spellStart"/>
-      <w:r>
-        <w:t>el</w:t>
-      </w:r>
-      <w:proofErr w:type="spellEnd"/>
-      <w:r>
-        <w:t xml:space="preserve"> </w:t>
-      </w:r>
-      <w:proofErr w:type="spellStart"/>
-      <w:r>
-        <w:t>proyecto</w:t>
-      </w:r>
-      <w:proofErr w:type="spellEnd"/>
-      <w:r>
-        <w:t xml:space="preserve"> </w:t>
-      </w:r>
-      <w:proofErr w:type="spellStart"/>
-      <w:r>
-        <w:t>está</w:t>
-      </w:r>
-      <w:proofErr w:type="spellEnd"/>
-      <w:r>
-        <w:t xml:space="preserve"> </w:t>
-      </w:r>
-      <w:proofErr w:type="spellStart"/>
-      <w:r>
-        <w:t>preparado</w:t>
-      </w:r>
-      <w:proofErr w:type="spellEnd"/>
-      <w:r>
-        <w:t xml:space="preserve"> para </w:t>
-      </w:r>
-      <w:proofErr w:type="spellStart"/>
-      <w:r>
-        <w:t>iniciar</w:t>
-      </w:r>
-      <w:proofErr w:type="spellEnd"/>
-      <w:r>
-        <w:t xml:space="preserve"> Desktop/Tauri </w:t>
-      </w:r>
-      <w:proofErr w:type="spellStart"/>
-      <w:r>
-        <w:t>institucional</w:t>
-      </w:r>
-      <w:proofErr w:type="spellEnd"/>
-      <w:r>
-        <w:t>.</w:t>
+        <w:t>La revisión actual evidencia que CitaJusta cuenta con HU-001 a HU-029 completadas e integradas. El MVP Web permanece cerrado y Sprint 7 ya materializó la aplicación institucional Desktop/Tauri: HU-027 fundó el cliente nativo, HU-028 incorporó autenticación real y cliente compartido, y HU-029 entregó gestión de sedes/servicios con RBAC y aislamiento institucional. El siguiente PBI Desktop queda pendiente de refinamiento antes de incorporarse formalmente al Sprint.</w:t>
       </w:r>
     </w:p>
     <w:sectPr>

</xml_diff>